<commit_message>
Finalizada fase de extracción SQL y carga masiva a Azure Landing Zone
</commit_message>
<xml_diff>
--- a/informe/INFORME.docx
+++ b/informe/INFORME.docx
@@ -413,10 +413,11 @@
       </w:pPr>
       <w:r>
         <w:rPr>
+          <w:noProof/>
           <w:lang w:val="es-ES"/>
         </w:rPr>
         <w:drawing>
-          <wp:anchor distT="0" distB="0" distL="114300" distR="114300" simplePos="0" relativeHeight="251658240" behindDoc="0" locked="0" layoutInCell="1" allowOverlap="1" wp14:anchorId="100B7476" wp14:editId="77BC24E5">
+          <wp:anchor distT="0" distB="0" distL="114300" distR="114300" simplePos="0" relativeHeight="251658240" behindDoc="0" locked="0" layoutInCell="1" allowOverlap="1" wp14:anchorId="100B7476" wp14:editId="6758D97C">
             <wp:simplePos x="0" y="0"/>
             <wp:positionH relativeFrom="column">
               <wp:posOffset>360045</wp:posOffset>
@@ -467,6 +468,7 @@
       </w:r>
       <w:r>
         <w:rPr>
+          <w:noProof/>
           <w:lang w:val="es-ES"/>
         </w:rPr>
         <w:drawing>
@@ -507,6 +509,7 @@
       </w:r>
       <w:r>
         <w:rPr>
+          <w:noProof/>
           <w:lang w:val="es-ES"/>
         </w:rPr>
         <w:drawing>
@@ -564,6 +567,7 @@
       </w:pPr>
       <w:r>
         <w:rPr>
+          <w:noProof/>
           <w:lang w:val="es-ES"/>
         </w:rPr>
         <w:lastRenderedPageBreak/>
@@ -610,6 +614,606 @@
         <w:rPr>
           <w:lang w:val="es-ES"/>
         </w:rPr>
+      </w:pPr>
+    </w:p>
+    <w:p>
+      <w:pPr>
+        <w:ind w:left="567"/>
+        <w:rPr>
+          <w:lang w:val="es-ES"/>
+        </w:rPr>
+      </w:pPr>
+      <w:r>
+        <w:rPr>
+          <w:lang w:val="es-ES"/>
+        </w:rPr>
+        <w:t xml:space="preserve">Configuración de </w:t>
+      </w:r>
+      <w:proofErr w:type="spellStart"/>
+      <w:r>
+        <w:rPr>
+          <w:lang w:val="es-ES"/>
+        </w:rPr>
+        <w:t>azure</w:t>
+      </w:r>
+      <w:proofErr w:type="spellEnd"/>
+      <w:r>
+        <w:rPr>
+          <w:lang w:val="es-ES"/>
+        </w:rPr>
+        <w:t xml:space="preserve"> </w:t>
+      </w:r>
+    </w:p>
+    <w:p>
+      <w:pPr>
+        <w:ind w:left="567"/>
+        <w:rPr>
+          <w:lang w:val="es-ES"/>
+        </w:rPr>
+      </w:pPr>
+    </w:p>
+    <w:p>
+      <w:pPr>
+        <w:ind w:left="567"/>
+        <w:rPr>
+          <w:lang w:val="es-ES"/>
+        </w:rPr>
+      </w:pPr>
+      <w:r>
+        <w:rPr>
+          <w:lang w:val="es-ES"/>
+        </w:rPr>
+        <w:t xml:space="preserve">Cuenta de almacenamiento en el </w:t>
+      </w:r>
+      <w:proofErr w:type="spellStart"/>
+      <w:r>
+        <w:rPr>
+          <w:lang w:val="es-ES"/>
+        </w:rPr>
+        <w:t>storad</w:t>
+      </w:r>
+      <w:proofErr w:type="spellEnd"/>
+      <w:r>
+        <w:rPr>
+          <w:lang w:val="es-ES"/>
+        </w:rPr>
+        <w:t xml:space="preserve"> de </w:t>
+      </w:r>
+      <w:proofErr w:type="spellStart"/>
+      <w:r>
+        <w:rPr>
+          <w:lang w:val="es-ES"/>
+        </w:rPr>
+        <w:t>azure</w:t>
+      </w:r>
+      <w:proofErr w:type="spellEnd"/>
+    </w:p>
+    <w:p>
+      <w:pPr>
+        <w:ind w:left="567"/>
+        <w:rPr>
+          <w:lang w:val="es-ES"/>
+        </w:rPr>
+      </w:pPr>
+      <w:r>
+        <w:rPr>
+          <w:noProof/>
+          <w:lang w:val="es-ES"/>
+        </w:rPr>
+        <w:drawing>
+          <wp:inline distT="0" distB="0" distL="0" distR="0" wp14:anchorId="395CC06B" wp14:editId="140399C8">
+            <wp:extent cx="5400040" cy="3956685"/>
+            <wp:effectExtent l="0" t="0" r="0" b="5715"/>
+            <wp:docPr id="387449464" name="Imagen 1"/>
+            <wp:cNvGraphicFramePr>
+              <a:graphicFrameLocks xmlns:a="http://schemas.openxmlformats.org/drawingml/2006/main" noChangeAspect="1"/>
+            </wp:cNvGraphicFramePr>
+            <a:graphic xmlns:a="http://schemas.openxmlformats.org/drawingml/2006/main">
+              <a:graphicData uri="http://schemas.openxmlformats.org/drawingml/2006/picture">
+                <pic:pic xmlns:pic="http://schemas.openxmlformats.org/drawingml/2006/picture">
+                  <pic:nvPicPr>
+                    <pic:cNvPr id="387449464" name=""/>
+                    <pic:cNvPicPr/>
+                  </pic:nvPicPr>
+                  <pic:blipFill>
+                    <a:blip r:embed="rId12"/>
+                    <a:stretch>
+                      <a:fillRect/>
+                    </a:stretch>
+                  </pic:blipFill>
+                  <pic:spPr>
+                    <a:xfrm>
+                      <a:off x="0" y="0"/>
+                      <a:ext cx="5400040" cy="3956685"/>
+                    </a:xfrm>
+                    <a:prstGeom prst="rect">
+                      <a:avLst/>
+                    </a:prstGeom>
+                  </pic:spPr>
+                </pic:pic>
+              </a:graphicData>
+            </a:graphic>
+          </wp:inline>
+        </w:drawing>
+      </w:r>
+    </w:p>
+    <w:p>
+      <w:pPr>
+        <w:ind w:left="567"/>
+        <w:rPr>
+          <w:lang w:val="es-ES"/>
+        </w:rPr>
+      </w:pPr>
+      <w:r>
+        <w:rPr>
+          <w:lang w:val="es-ES"/>
+        </w:rPr>
+        <w:t xml:space="preserve">Información general de </w:t>
+      </w:r>
+      <w:proofErr w:type="spellStart"/>
+      <w:r>
+        <w:rPr>
+          <w:lang w:val="es-ES"/>
+        </w:rPr>
+        <w:t>datalake</w:t>
+      </w:r>
+      <w:proofErr w:type="spellEnd"/>
+    </w:p>
+    <w:p>
+      <w:pPr>
+        <w:ind w:left="567"/>
+        <w:rPr>
+          <w:lang w:val="es-ES"/>
+        </w:rPr>
+      </w:pPr>
+      <w:r>
+        <w:rPr>
+          <w:noProof/>
+          <w:lang w:val="es-ES"/>
+        </w:rPr>
+        <w:lastRenderedPageBreak/>
+        <w:drawing>
+          <wp:inline distT="0" distB="0" distL="0" distR="0" wp14:anchorId="4ACC0F5B" wp14:editId="6BB9B43D">
+            <wp:extent cx="5400040" cy="2209800"/>
+            <wp:effectExtent l="0" t="0" r="0" b="0"/>
+            <wp:docPr id="1437647656" name="Imagen 1"/>
+            <wp:cNvGraphicFramePr>
+              <a:graphicFrameLocks xmlns:a="http://schemas.openxmlformats.org/drawingml/2006/main" noChangeAspect="1"/>
+            </wp:cNvGraphicFramePr>
+            <a:graphic xmlns:a="http://schemas.openxmlformats.org/drawingml/2006/main">
+              <a:graphicData uri="http://schemas.openxmlformats.org/drawingml/2006/picture">
+                <pic:pic xmlns:pic="http://schemas.openxmlformats.org/drawingml/2006/picture">
+                  <pic:nvPicPr>
+                    <pic:cNvPr id="1437647656" name=""/>
+                    <pic:cNvPicPr/>
+                  </pic:nvPicPr>
+                  <pic:blipFill>
+                    <a:blip r:embed="rId13"/>
+                    <a:stretch>
+                      <a:fillRect/>
+                    </a:stretch>
+                  </pic:blipFill>
+                  <pic:spPr>
+                    <a:xfrm>
+                      <a:off x="0" y="0"/>
+                      <a:ext cx="5400040" cy="2209800"/>
+                    </a:xfrm>
+                    <a:prstGeom prst="rect">
+                      <a:avLst/>
+                    </a:prstGeom>
+                  </pic:spPr>
+                </pic:pic>
+              </a:graphicData>
+            </a:graphic>
+          </wp:inline>
+        </w:drawing>
+      </w:r>
+    </w:p>
+    <w:p>
+      <w:pPr>
+        <w:ind w:left="567"/>
+        <w:rPr>
+          <w:lang w:val="es-ES"/>
+        </w:rPr>
+      </w:pPr>
+      <w:r>
+        <w:rPr>
+          <w:noProof/>
+          <w:lang w:val="es-ES"/>
+        </w:rPr>
+        <w:drawing>
+          <wp:inline distT="0" distB="0" distL="0" distR="0" wp14:anchorId="0C211572" wp14:editId="768AF926">
+            <wp:extent cx="5400040" cy="2363470"/>
+            <wp:effectExtent l="0" t="0" r="0" b="0"/>
+            <wp:docPr id="58472086" name="Imagen 1"/>
+            <wp:cNvGraphicFramePr>
+              <a:graphicFrameLocks xmlns:a="http://schemas.openxmlformats.org/drawingml/2006/main" noChangeAspect="1"/>
+            </wp:cNvGraphicFramePr>
+            <a:graphic xmlns:a="http://schemas.openxmlformats.org/drawingml/2006/main">
+              <a:graphicData uri="http://schemas.openxmlformats.org/drawingml/2006/picture">
+                <pic:pic xmlns:pic="http://schemas.openxmlformats.org/drawingml/2006/picture">
+                  <pic:nvPicPr>
+                    <pic:cNvPr id="58472086" name=""/>
+                    <pic:cNvPicPr/>
+                  </pic:nvPicPr>
+                  <pic:blipFill>
+                    <a:blip r:embed="rId14"/>
+                    <a:stretch>
+                      <a:fillRect/>
+                    </a:stretch>
+                  </pic:blipFill>
+                  <pic:spPr>
+                    <a:xfrm>
+                      <a:off x="0" y="0"/>
+                      <a:ext cx="5400040" cy="2363470"/>
+                    </a:xfrm>
+                    <a:prstGeom prst="rect">
+                      <a:avLst/>
+                    </a:prstGeom>
+                  </pic:spPr>
+                </pic:pic>
+              </a:graphicData>
+            </a:graphic>
+          </wp:inline>
+        </w:drawing>
+      </w:r>
+    </w:p>
+    <w:p>
+      <w:pPr>
+        <w:ind w:left="567"/>
+        <w:rPr>
+          <w:lang w:val="es-ES"/>
+        </w:rPr>
+      </w:pPr>
+    </w:p>
+    <w:p>
+      <w:pPr>
+        <w:ind w:left="567"/>
+        <w:rPr>
+          <w:lang w:val="es-ES"/>
+        </w:rPr>
+      </w:pPr>
+    </w:p>
+    <w:p>
+      <w:pPr>
+        <w:ind w:left="567"/>
+        <w:rPr>
+          <w:lang w:val="es-ES"/>
+        </w:rPr>
+      </w:pPr>
+    </w:p>
+    <w:p>
+      <w:pPr>
+        <w:ind w:left="567"/>
+        <w:rPr>
+          <w:lang w:val="es-ES"/>
+        </w:rPr>
+      </w:pPr>
+      <w:r>
+        <w:rPr>
+          <w:lang w:val="es-ES"/>
+        </w:rPr>
+        <w:t xml:space="preserve">Librerías antes de conectarse a zure </w:t>
+      </w:r>
+    </w:p>
+    <w:p>
+      <w:pPr>
+        <w:ind w:left="567"/>
+        <w:rPr>
+          <w:lang w:val="es-ES"/>
+        </w:rPr>
+      </w:pPr>
+      <w:r>
+        <w:rPr>
+          <w:noProof/>
+          <w:lang w:val="es-ES"/>
+        </w:rPr>
+        <w:lastRenderedPageBreak/>
+        <w:drawing>
+          <wp:inline distT="0" distB="0" distL="0" distR="0" wp14:anchorId="44103929" wp14:editId="3D6D9FBA">
+            <wp:extent cx="5372566" cy="6995766"/>
+            <wp:effectExtent l="0" t="0" r="0" b="0"/>
+            <wp:docPr id="919698558" name="Imagen 1"/>
+            <wp:cNvGraphicFramePr>
+              <a:graphicFrameLocks xmlns:a="http://schemas.openxmlformats.org/drawingml/2006/main" noChangeAspect="1"/>
+            </wp:cNvGraphicFramePr>
+            <a:graphic xmlns:a="http://schemas.openxmlformats.org/drawingml/2006/main">
+              <a:graphicData uri="http://schemas.openxmlformats.org/drawingml/2006/picture">
+                <pic:pic xmlns:pic="http://schemas.openxmlformats.org/drawingml/2006/picture">
+                  <pic:nvPicPr>
+                    <pic:cNvPr id="919698558" name=""/>
+                    <pic:cNvPicPr/>
+                  </pic:nvPicPr>
+                  <pic:blipFill>
+                    <a:blip r:embed="rId15"/>
+                    <a:stretch>
+                      <a:fillRect/>
+                    </a:stretch>
+                  </pic:blipFill>
+                  <pic:spPr>
+                    <a:xfrm>
+                      <a:off x="0" y="0"/>
+                      <a:ext cx="5372566" cy="6995766"/>
+                    </a:xfrm>
+                    <a:prstGeom prst="rect">
+                      <a:avLst/>
+                    </a:prstGeom>
+                  </pic:spPr>
+                </pic:pic>
+              </a:graphicData>
+            </a:graphic>
+          </wp:inline>
+        </w:drawing>
+      </w:r>
+    </w:p>
+    <w:p>
+      <w:pPr>
+        <w:ind w:left="567"/>
+        <w:rPr>
+          <w:lang w:val="es-ES"/>
+        </w:rPr>
+      </w:pPr>
+      <w:r>
+        <w:rPr>
+          <w:lang w:val="es-ES"/>
+        </w:rPr>
+        <w:lastRenderedPageBreak/>
+        <w:tab/>
+      </w:r>
+      <w:r>
+        <w:rPr>
+          <w:lang w:val="es-ES"/>
+        </w:rPr>
+        <w:drawing>
+          <wp:inline distT="0" distB="0" distL="0" distR="0" wp14:anchorId="46DA7D2D" wp14:editId="4700F785">
+            <wp:extent cx="3185436" cy="6462320"/>
+            <wp:effectExtent l="0" t="0" r="0" b="0"/>
+            <wp:docPr id="1672547961" name="Imagen 1"/>
+            <wp:cNvGraphicFramePr>
+              <a:graphicFrameLocks xmlns:a="http://schemas.openxmlformats.org/drawingml/2006/main" noChangeAspect="1"/>
+            </wp:cNvGraphicFramePr>
+            <a:graphic xmlns:a="http://schemas.openxmlformats.org/drawingml/2006/main">
+              <a:graphicData uri="http://schemas.openxmlformats.org/drawingml/2006/picture">
+                <pic:pic xmlns:pic="http://schemas.openxmlformats.org/drawingml/2006/picture">
+                  <pic:nvPicPr>
+                    <pic:cNvPr id="1672547961" name=""/>
+                    <pic:cNvPicPr/>
+                  </pic:nvPicPr>
+                  <pic:blipFill>
+                    <a:blip r:embed="rId16"/>
+                    <a:stretch>
+                      <a:fillRect/>
+                    </a:stretch>
+                  </pic:blipFill>
+                  <pic:spPr>
+                    <a:xfrm>
+                      <a:off x="0" y="0"/>
+                      <a:ext cx="3185436" cy="6462320"/>
+                    </a:xfrm>
+                    <a:prstGeom prst="rect">
+                      <a:avLst/>
+                    </a:prstGeom>
+                  </pic:spPr>
+                </pic:pic>
+              </a:graphicData>
+            </a:graphic>
+          </wp:inline>
+        </w:drawing>
+      </w:r>
+    </w:p>
+    <w:p>
+      <w:pPr>
+        <w:ind w:left="567"/>
+        <w:rPr>
+          <w:b/>
+          <w:bCs/>
+        </w:rPr>
+      </w:pPr>
+      <w:r>
+        <w:rPr>
+          <w:b/>
+          <w:bCs/>
+        </w:rPr>
+        <w:t>Resumen para el Informe (Infraestructura de Software)</w:t>
+      </w:r>
+    </w:p>
+    <w:p>
+      <w:pPr>
+        <w:ind w:left="567"/>
+      </w:pPr>
+      <w:r>
+        <w:t>Agrega este párrafo a tu informe para explicar esta parte:</w:t>
+      </w:r>
+    </w:p>
+    <w:p>
+      <w:pPr>
+        <w:ind w:left="567"/>
+      </w:pPr>
+      <w:r>
+        <w:t xml:space="preserve">"Para la fase de desarrollo, se implementó una arquitectura de software basada en </w:t>
+      </w:r>
+      <w:r>
+        <w:rPr>
+          <w:b/>
+          <w:bCs/>
+        </w:rPr>
+        <w:t>Python 3.12</w:t>
+      </w:r>
+      <w:r>
+        <w:t xml:space="preserve"> y el </w:t>
+      </w:r>
+      <w:r>
+        <w:rPr>
+          <w:b/>
+          <w:bCs/>
+        </w:rPr>
+        <w:t>SDK oficial de Azure</w:t>
+      </w:r>
+      <w:r>
+        <w:t xml:space="preserve">. Se utilizó un entorno virtual gestionado con </w:t>
+      </w:r>
+      <w:proofErr w:type="spellStart"/>
+      <w:r>
+        <w:t>pip</w:t>
+      </w:r>
+      <w:proofErr w:type="spellEnd"/>
+      <w:r>
+        <w:t xml:space="preserve"> para garantizar la compatibilidad de librerías críticas como </w:t>
+      </w:r>
+      <w:proofErr w:type="spellStart"/>
+      <w:r>
+        <w:t>azure</w:t>
+      </w:r>
+      <w:proofErr w:type="spellEnd"/>
+      <w:r>
+        <w:t>-</w:t>
+      </w:r>
+      <w:proofErr w:type="spellStart"/>
+      <w:r>
+        <w:t>storage</w:t>
+      </w:r>
+      <w:proofErr w:type="spellEnd"/>
+      <w:r>
+        <w:t xml:space="preserve">-blob y pandas. La seguridad de las credenciales se gestionó mediante variables de entorno en un </w:t>
+      </w:r>
+      <w:proofErr w:type="gramStart"/>
+      <w:r>
+        <w:t>archivo .</w:t>
+      </w:r>
+      <w:proofErr w:type="spellStart"/>
+      <w:r>
+        <w:t>env</w:t>
+      </w:r>
+      <w:proofErr w:type="spellEnd"/>
+      <w:proofErr w:type="gramEnd"/>
+      <w:r>
+        <w:t>, siguiendo los estándares de seguridad de la industria para evitar la exposición de llaves de acceso en repositorios públicos."</w:t>
+      </w:r>
+    </w:p>
+    <w:p>
+      <w:pPr>
+        <w:ind w:left="567"/>
+      </w:pPr>
+    </w:p>
+    <w:p>
+      <w:pPr>
+        <w:ind w:left="567"/>
+      </w:pPr>
+    </w:p>
+    <w:p>
+      <w:pPr>
+        <w:ind w:left="567"/>
+      </w:pPr>
+      <w:r>
+        <w:lastRenderedPageBreak/>
+        <w:t xml:space="preserve">Prueba de conexión a </w:t>
+      </w:r>
+      <w:proofErr w:type="spellStart"/>
+      <w:r>
+        <w:t>azure</w:t>
+      </w:r>
+      <w:proofErr w:type="spellEnd"/>
+      <w:r>
+        <w:t xml:space="preserve"> </w:t>
+      </w:r>
+    </w:p>
+    <w:p>
+      <w:pPr>
+        <w:ind w:left="567"/>
+      </w:pPr>
+      <w:r>
+        <w:drawing>
+          <wp:inline distT="0" distB="0" distL="0" distR="0" wp14:anchorId="6F2C55B8" wp14:editId="1A7B4136">
+            <wp:extent cx="5400040" cy="2150745"/>
+            <wp:effectExtent l="0" t="0" r="0" b="1905"/>
+            <wp:docPr id="1237777989" name="Imagen 1"/>
+            <wp:cNvGraphicFramePr>
+              <a:graphicFrameLocks xmlns:a="http://schemas.openxmlformats.org/drawingml/2006/main" noChangeAspect="1"/>
+            </wp:cNvGraphicFramePr>
+            <a:graphic xmlns:a="http://schemas.openxmlformats.org/drawingml/2006/main">
+              <a:graphicData uri="http://schemas.openxmlformats.org/drawingml/2006/picture">
+                <pic:pic xmlns:pic="http://schemas.openxmlformats.org/drawingml/2006/picture">
+                  <pic:nvPicPr>
+                    <pic:cNvPr id="1237777989" name=""/>
+                    <pic:cNvPicPr/>
+                  </pic:nvPicPr>
+                  <pic:blipFill>
+                    <a:blip r:embed="rId17"/>
+                    <a:stretch>
+                      <a:fillRect/>
+                    </a:stretch>
+                  </pic:blipFill>
+                  <pic:spPr>
+                    <a:xfrm>
+                      <a:off x="0" y="0"/>
+                      <a:ext cx="5400040" cy="2150745"/>
+                    </a:xfrm>
+                    <a:prstGeom prst="rect">
+                      <a:avLst/>
+                    </a:prstGeom>
+                  </pic:spPr>
+                </pic:pic>
+              </a:graphicData>
+            </a:graphic>
+          </wp:inline>
+        </w:drawing>
+      </w:r>
+    </w:p>
+    <w:p>
+      <w:pPr>
+        <w:ind w:left="567"/>
+      </w:pPr>
+      <w:r>
+        <w:drawing>
+          <wp:inline distT="0" distB="0" distL="0" distR="0" wp14:anchorId="1CA11FEE" wp14:editId="363D4B10">
+            <wp:extent cx="5400040" cy="2573020"/>
+            <wp:effectExtent l="0" t="0" r="0" b="0"/>
+            <wp:docPr id="1783288726" name="Imagen 1"/>
+            <wp:cNvGraphicFramePr>
+              <a:graphicFrameLocks xmlns:a="http://schemas.openxmlformats.org/drawingml/2006/main" noChangeAspect="1"/>
+            </wp:cNvGraphicFramePr>
+            <a:graphic xmlns:a="http://schemas.openxmlformats.org/drawingml/2006/main">
+              <a:graphicData uri="http://schemas.openxmlformats.org/drawingml/2006/picture">
+                <pic:pic xmlns:pic="http://schemas.openxmlformats.org/drawingml/2006/picture">
+                  <pic:nvPicPr>
+                    <pic:cNvPr id="1783288726" name=""/>
+                    <pic:cNvPicPr/>
+                  </pic:nvPicPr>
+                  <pic:blipFill>
+                    <a:blip r:embed="rId18"/>
+                    <a:stretch>
+                      <a:fillRect/>
+                    </a:stretch>
+                  </pic:blipFill>
+                  <pic:spPr>
+                    <a:xfrm>
+                      <a:off x="0" y="0"/>
+                      <a:ext cx="5400040" cy="2573020"/>
+                    </a:xfrm>
+                    <a:prstGeom prst="rect">
+                      <a:avLst/>
+                    </a:prstGeom>
+                  </pic:spPr>
+                </pic:pic>
+              </a:graphicData>
+            </a:graphic>
+          </wp:inline>
+        </w:drawing>
+      </w:r>
+    </w:p>
+    <w:p>
+      <w:pPr>
+        <w:ind w:left="567"/>
+      </w:pPr>
+    </w:p>
+    <w:p>
+      <w:pPr>
+        <w:ind w:left="567"/>
+      </w:pPr>
+    </w:p>
+    <w:p>
+      <w:pPr>
+        <w:ind w:left="567"/>
       </w:pPr>
     </w:p>
     <w:sectPr>
@@ -1474,7 +2078,6 @@
   <w:style w:type="character" w:default="1" w:styleId="Fuentedeprrafopredeter">
     <w:name w:val="Default Paragraph Font"/>
     <w:uiPriority w:val="1"/>
-    <w:semiHidden/>
     <w:unhideWhenUsed/>
   </w:style>
   <w:style w:type="table" w:default="1" w:styleId="Tablanormal">

</xml_diff>